<commit_message>
build: rebuild dist/downloads dissertation+manuscript DOCX/PDF (CĐ2+chapter finalization)
Regenerates the dist/downloads deliverables from updated source so they carry
the Upper Echelons->control demotion, H5 concavity framing, and G2 numbers.
Removes transient .plans/ working artifacts.

https://claude.ai/code/session_01TNqoRFY1vAVQL6GWg8X9M3
</commit_message>
<xml_diff>
--- a/dist/downloads/chuong_2_tong_quan_tai_lieu.docx
+++ b/dist/downloads/chuong_2_tong_quan_tai_lieu.docx
@@ -427,7 +427,7 @@
         <w:pStyle w:val="BodyText"/>
       </w:pPr>
       <w:r>
-        <w:t xml:space="preserve">Một bước tinh chỉnh quan trọng đến từ Xu (2024), người phân tách quy tắc hình thức trên giấy (de jure) với thực thi thực tế (de facto), qua đó giải thích vì sao những nền kinh tế có khung pháp lý tương tự lại tạo ra kết quả kinh doanh rất khác nhau. Kim et al. (2026) cung cấp một khung đo lường năng lực thể chế (institutional capacity) theo hai chiều, chiều tổ chức gồm nhân sự, tài chính, hệ thống thông tin, quản lý, và chiều quản trị gồm minh bạch, độc lập, trách nhiệm giải trình; nghiên cứu đa quốc gia này xác nhận tương quan dương bền vững giữa năng lực thể chế và phát triển kinh tế. Về phía bằng chứng tổng hợp, Marano et al. (2016) trên 170 nghiên cứu thuộc 32 quốc gia cho thấy thể chế quốc gia nguồn điều tiết đáng kể quan hệ I-P, với khả năng dịch chuyển điểm uốn của đường cong; doanh nghiệp từ các nền kinh tế thể chế yếu hơn thường thu được lợi ích thấp hơn, thậm chí chịu tổn thất khi quốc tế hóa. Cuervo-Cazurra et al. (2018) bổ sung một góc nhìn khác: sự bất định thể chế ở quốc gia nguồn không chỉ là thách thức mà còn có thể rèn cho doanh nghiệp một năng lực quản lý bất định đặc thù, nhờ đó họ cạnh tranh hiệu quả hơn ở những thị trường nước ngoài có đặc điểm tương tự. Lý thuyết thể chế là nền tảng lý luận cho giả thuyết H5 và cho khung phân tích ICRV trình bày ở Mục 2.3.</w:t>
+        <w:t xml:space="preserve">Một bước tinh chỉnh quan trọng đến từ Xu (2024), người phân tách quy tắc hình thức trên giấy (de jure) với thực thi thực tế (de facto), qua đó giải thích vì sao những nền kinh tế có khung pháp lý tương tự lại tạo ra kết quả kinh doanh rất khác nhau. Kim et al. (2026) cung cấp một khung đo lường năng lực thể chế (institutional capacity) theo hai chiều, chiều tổ chức gồm nhân sự, tài chính, hệ thống thông tin, quản lý, và chiều quản trị gồm minh bạch, độc lập, trách nhiệm giải trình; nghiên cứu đa quốc gia này xác nhận tương quan dương bền vững giữa năng lực thể chế và phát triển kinh tế. Về phía bằng chứng tổng hợp, Marano et al. (2016) trên 170 nghiên cứu thuộc 32 quốc gia cho thấy thể chế quốc gia nguồn điều tiết đáng kể quan hệ I-P, với khả năng thay đổi độ cong của đường cong; doanh nghiệp từ các nền kinh tế thể chế yếu hơn thường thu được lợi ích thấp hơn, thậm chí chịu tổn thất khi quốc tế hóa. Cuervo-Cazurra et al. (2018) bổ sung một góc nhìn khác: sự bất định thể chế ở quốc gia nguồn không chỉ là thách thức mà còn có thể rèn cho doanh nghiệp một năng lực quản lý bất định đặc thù, nhờ đó họ cạnh tranh hiệu quả hơn ở những thị trường nước ngoài có đặc điểm tương tự. Lý thuyết thể chế là nền tảng lý luận cho giả thuyết H5 và cho khung phân tích ICRV trình bày ở Mục 2.3.</w:t>
       </w:r>
     </w:p>
     <w:bookmarkEnd w:id="28"/>
@@ -453,7 +453,25 @@
         <w:pStyle w:val="BodyText"/>
       </w:pPr>
       <w:r>
-        <w:t xml:space="preserve">Đặt trong bối cảnh quốc tế hóa, lý thuyết này có hai hàm ý trực tiếp. Một mặt, kinh nghiệm quốc tế của nhà quản trị cấp cao, đo bằng số năm làm việc hoặc học tập ở nước ngoài hay mức độ tiếp xúc với thị trường quốc tế, giúp giảm nhận thức về gánh nặng người nước ngoài và nâng cao khả năng đánh giá cơ hội, quản trị rủi ro ở thị trường quốc tế (Hsu et al., 2013; Sambharya, 1996). Mặt khác, sự đa dạng giới tính trong lãnh đạo, đặc biệt là sự hiện diện của quản trị viên nữ ở các vị trí lãnh đạo, gắn với nhận thức chiến lược đa chiều hơn và thực tiễn quản trị rủi ro thận trọng hơn, qua đó tác động tích cực đến hiệu quả doanh nghiệp trong quá trình quốc tế hóa (Post &amp; Byron, 2015). Hai hàm ý này là cơ sở lý thuyết cho giả thuyết H4 về vai trò của đặc điểm nhà quản trị cấp cao. Tuy nhiên, trên mẫu đa quốc gia quy mô lớn, khác biệt cấp doanh nghiệp về đặc điểm nhà quản trị nhiều khả năng nâng mặt bằng hiệu quả hơn là tái định hình toàn bộ độ cong của đường quan hệ I-P, vốn được chi phối chủ yếu bởi các yếu tố thể chế và mức độ trưởng thành thị trường ở cấp nền kinh tế (Do &amp; Phan, 2026d).</w:t>
+        <w:t xml:space="preserve">Đặt trong bối cảnh quốc tế hóa, lý thuyết này có hai hàm ý trực tiếp. Một mặt, kinh nghiệm quốc tế của nhà quản trị cấp cao, đo bằng số năm làm việc hoặc học tập ở nước ngoài hay mức độ tiếp xúc với thị trường quốc tế, giúp giảm nhận thức về gánh nặng người nước ngoài và nâng cao khả năng đánh giá cơ hội, quản trị rủi ro ở thị trường quốc tế (Hsu et al., 2013; Sambharya, 1996). Mặt khác, sự đa dạng giới tính trong lãnh đạo, đặc biệt là sự hiện diện của quản trị viên nữ ở các vị trí lãnh đạo, gắn với nhận thức chiến lược đa chiều hơn và thực tiễn quản trị rủi ro thận trọng hơn, qua đó tác động tích cực đến hiệu quả doanh nghiệp trong quá trình quốc tế hóa (Post &amp; Byron, 2015). Hai hàm ý này là cơ sở lý thuyết cho khối kiểm soát quản trị nội sinh H4. Tuy nhiên, trên mẫu đa quốc gia quy mô lớn, khác biệt cấp doanh nghiệp về đặc điểm nhà quản trị nhiều khả năng nâng mặt bằng hiệu quả hơn là tái định hình toàn bộ độ cong của đường quan hệ I-P, vốn được chi phối chủ yếu bởi các yếu tố thể chế và mức độ trưởng thành thị trường ở cấp nền kinh tế (Do &amp; Phan, 2026d). Vì lý do đó, và vì năng lực cùng sự đa dạng giới của nhà quản trị có thể đồng thời tác động đến quyết định xuất khẩu, đến năng lực công nghệ và đến năng suất, khung của luận án không nâng đặc điểm nhà quản trị thành một tầng điều tiết trọng tâm mà đưa kinh nghiệm, học vấn và giới tính vào như nhóm biến kiểm soát quản trị nội sinh. Để bảo vệ tính nhân quả thuần khiết của tương tác Thể chế × Công nghệ, các đặc điểm nhà quản trị (kinh nghiệm, học vấn, giới tính) được đưa vào như biến kiểm soát quản trị nội sinh, không phải nhân tố điều tiết trọng tâm của đường cong I-P; lựa chọn này tránh thiên lệch biến bị bỏ sót và ngăn hiện tượng</w:t>
+      </w:r>
+      <w:r>
+        <w:t xml:space="preserve"> </w:t>
+      </w:r>
+      <w:r>
+        <w:t xml:space="preserve">“</w:t>
+      </w:r>
+      <w:r>
+        <w:t xml:space="preserve">Kitchen Sink Modeling</w:t>
+      </w:r>
+      <w:r>
+        <w:t xml:space="preserve">”</w:t>
+      </w:r>
+      <w:r>
+        <w:t xml:space="preserve"> </w:t>
+      </w:r>
+      <w:r>
+        <w:t xml:space="preserve">làm loãng thông điệp vĩ mô Institution × Technology. Bốn nhân tố điều tiết trọng tâm của khung do đó là TCI (H2), DAI (H3), chế độ thể chế ICRV (H5) và thời gian (H6).</w:t>
       </w:r>
     </w:p>
     <w:bookmarkEnd w:id="29"/>
@@ -760,7 +778,7 @@
               <w:jc w:val="left"/>
             </w:pPr>
             <w:r>
-              <w:t xml:space="preserve">Chất lượng thể chế dịch chuyển vị trí điểm uốn</w:t>
+              <w:t xml:space="preserve">Chất lượng thể chế chi phối độ cong đường cong I-P</w:t>
             </w:r>
           </w:p>
         </w:tc>
@@ -822,19 +840,19 @@
               <w:jc w:val="left"/>
             </w:pPr>
             <w:r>
-              <w:t xml:space="preserve">Đặc điểm lãnh đạo nâng mặt bằng hiệu quả</w:t>
-            </w:r>
-          </w:p>
-        </w:tc>
-        <w:tc>
-          <w:tcPr/>
-          <w:p>
-            <w:pPr>
-              <w:pStyle w:val="Compact"/>
-              <w:jc w:val="left"/>
-            </w:pPr>
-            <w:r>
-              <w:t xml:space="preserve">H4</w:t>
+              <w:t xml:space="preserve">Đặc điểm lãnh đạo nâng mặt bằng hiệu quả (kiểm soát quản trị nội sinh, không phải điều tiết trọng tâm độ cong)</w:t>
+            </w:r>
+          </w:p>
+        </w:tc>
+        <w:tc>
+          <w:tcPr/>
+          <w:p>
+            <w:pPr>
+              <w:pStyle w:val="Compact"/>
+              <w:jc w:val="left"/>
+            </w:pPr>
+            <w:r>
+              <w:t xml:space="preserve">H4 (kiểm soát quản trị nội sinh)</w:t>
             </w:r>
           </w:p>
         </w:tc>
@@ -1528,7 +1546,7 @@
         <w:pStyle w:val="BodyText"/>
       </w:pPr>
       <w:r>
-        <w:t xml:space="preserve">Cơ chế điều tiết của ICRV vận hành theo hai kênh đan xen. Kênh thứ nhất là dịch chuyển điểm uốn: ở môi trường thể chế chất lượng cao, doanh nghiệp cần một tỷ trọng xuất khẩu thấp hơn để bù đắp chi phí quốc tế hóa, nên điểm uốn tối ưu xuất hiện sớm hơn; ngược lại, ở môi trường thể chế yếu, chi phí giao dịch xuyên biên giới cao đẩy điểm uốn ra muộn hơn (Do &amp; Phan, 2026d). Kênh thứ hai là thay thế số cho thể chế (digital-for-institutional substitution): nơi thể chế chính thức cung cấp đầy đủ cơ chế thực thi hợp đồng, bảo vệ sở hữu trí tuệ và thông tin thị trường, công cụ số chỉ bổ sung biên; nơi khoảng trống thể chế ngự trị, công cụ số lại trở thành một sự thay thế đáng kể cho các cơ chế chính thức còn thiếu, qua đó vai trò định hình đường cong của DAI mạnh hơn ở nhóm thể chế yếu (Do &amp; Phan, 2026d). Đây chính là cơ sở của giả thuyết H5 và là phần mở rộng đa quốc gia của logic khoảng trống thể chế (Khanna &amp; Palepu, 2010) vào lĩnh vực số.</w:t>
+        <w:t xml:space="preserve">Cơ chế điều tiết của ICRV vận hành theo hai kênh đan xen. Kênh thứ nhất là thay đổi độ cong (biên độ) của đường cong: ở môi trường thể chế yếu, chi phí giao dịch xuyên biên giới cao làm độ cong của hình chữ U ngược sâu hơn — hình phạt hiệu quả đối với quốc tế hóa quá mức trở nên gay gắt hơn; ngược lại, ở môi trường thể chế mạnh, đường cong phẳng hơn, gần như tuyến tính. Điểm uốn không dịch chuyển đơn điệu theo chất lượng thể chế mà phân tán quanh mức ~40% (Do &amp; Phan, 2026d). Kênh thứ hai là thay thế số cho thể chế (digital-for-institutional substitution): nơi thể chế chính thức cung cấp đầy đủ cơ chế thực thi hợp đồng, bảo vệ sở hữu trí tuệ và thông tin thị trường, công cụ số chỉ bổ sung biên; nơi khoảng trống thể chế ngự trị, công cụ số lại trở thành một sự thay thế đáng kể cho các cơ chế chính thức còn thiếu, qua đó vai trò định hình đường cong của DAI mạnh hơn ở nhóm thể chế yếu (Do &amp; Phan, 2026d). Đây chính là cơ sở của giả thuyết H5 và là phần mở rộng đa quốc gia của logic khoảng trống thể chế (Khanna &amp; Palepu, 2010) vào lĩnh vực số.</w:t>
       </w:r>
     </w:p>
     <w:p>
@@ -1819,10 +1837,7 @@
         <w:pStyle w:val="BodyText"/>
       </w:pPr>
       <w:r>
-        <w:t xml:space="preserve">Marano et al. (2016) là công trình tập trung vào thể chế toàn diện nhất, với 170 nghiên cứu thuộc 32 quốc gia, chứng minh rằng chất lượng thể chế quốc gia nguồn có thể dịch chuyển điểm uốn tới khoảng $</w:t>
-      </w:r>
-      <w:r>
-        <w:t xml:space="preserve">$15% FSTS; đây là nền tảng quan trọng nhất ủng hộ dải biến thiên ICRV trong giả thuyết H5, song nghiên cứu không phân tách TCI với DAI và không có dữ liệu sau 2015. Wu et al. (2022) tổng hợp 20 năm bằng chứng từ doanh nghiệp đa quốc gia thị trường mới nổi và tìm thấy điểm uốn thấp hơn so với doanh nghiệp từ nền kinh tế phát triển khoảng 12-18% FSTS, do khoảng cách về năng lực hấp thụ; nghiên cứu không kiểm định giai đoạn số hóa và không dùng dữ liệu vi mô WBES.</w:t>
+        <w:t xml:space="preserve">Marano et al. (2016) là công trình tập trung vào thể chế toàn diện nhất, với 170 nghiên cứu thuộc 32 quốc gia, chứng minh rằng chất lượng thể chế quốc gia nguồn điều tiết đáng kể quan hệ I-P; đây là nền tảng quan trọng nhất ủng hộ dải biến thiên ICRV trong giả thuyết H5, song nghiên cứu không phân tách TCI với DAI và không có dữ liệu sau 2015. Wu et al. (2022) tổng hợp 20 năm bằng chứng từ doanh nghiệp đa quốc gia thị trường mới nổi và tìm thấy điểm uốn thấp hơn so với doanh nghiệp từ nền kinh tế phát triển khoảng 12-18% FSTS, do khoảng cách về năng lực hấp thụ; nghiên cứu không kiểm định giai đoạn số hóa và không dùng dữ liệu vi mô WBES.</w:t>
       </w:r>
     </w:p>
     <w:p>
@@ -1848,7 +1863,7 @@
         <w:pStyle w:val="FirstParagraph"/>
       </w:pPr>
       <w:r>
-        <w:t xml:space="preserve">Châu Á vừa là bối cảnh quan trọng vừa rất đặc thù đối với nghiên cứu I-P, nhờ hai đặc điểm hiếm khi cùng xuất hiện ở bất kỳ khu vực nào khác. Đặc điểm đầu tiên là sự đa dạng thể chế gần như ngoại lệ trên thế giới: từ Singapore với chất lượng quản trị hàng đầu đến các nền kinh tế cận biên với chất lượng quản trị rất yếu, từ Nhật Bản và Hàn Quốc với nền kinh tế phát triển hoàn thiện đến các nền kinh tế đảo nhỏ Thái Bình Dương có quy mô siêu nhỏ và hạ tầng thể chế còn sơ khai (Khanna &amp; Palepu, 2010; Peng, 2003). Đặc điểm còn lại là tốc độ chuyển đổi số và hội nhập quốc tế rất chênh lệch giữa các quốc gia trong khu vực. Tổng hợp bằng chứng đơn quốc gia ở châu Á cho thấy một bức tranh phân mảnh: có nghiên cứu báo cáo quan hệ dương, có nghiên cứu tìm thấy chữ U ngược, lại có nghiên cứu cho kết quả null hoặc âm (Do &amp; Phan, 2026d). Phản ứng quen thuộc của tài liệu là viện đến bối cảnh như một biến điều tiết, nhưng cách làm đó để ngỏ câu hỏi sâu hơn: nếu quan hệ I-P là phi tuyến, thì điều gì quyết định vị trí điểm uốn, và vì sao vị trí đó khác nhau có hệ thống giữa các doanh nghiệp và nền kinh tế?</w:t>
+        <w:t xml:space="preserve">Châu Á vừa là bối cảnh quan trọng vừa rất đặc thù đối với nghiên cứu I-P, nhờ hai đặc điểm hiếm khi cùng xuất hiện ở bất kỳ khu vực nào khác. Đặc điểm đầu tiên là sự đa dạng thể chế gần như ngoại lệ trên thế giới: từ Singapore với chất lượng quản trị hàng đầu đến các nền kinh tế cận biên với chất lượng quản trị rất yếu, từ Nhật Bản và Hàn Quốc với nền kinh tế phát triển hoàn thiện đến các nền kinh tế đảo nhỏ Thái Bình Dương có quy mô siêu nhỏ và hạ tầng thể chế còn sơ khai (Khanna &amp; Palepu, 2010; Peng, 2003). Đặc điểm còn lại là tốc độ chuyển đổi số và hội nhập quốc tế rất chênh lệch giữa các quốc gia trong khu vực. Tổng hợp bằng chứng đơn quốc gia ở châu Á cho thấy một bức tranh phân mảnh: có nghiên cứu báo cáo quan hệ dương, có nghiên cứu tìm thấy chữ U ngược, lại có nghiên cứu cho kết quả null hoặc âm (Do &amp; Phan, 2026d). Phản ứng quen thuộc của tài liệu là viện đến bối cảnh như một biến điều tiết, nhưng cách làm đó để ngỏ câu hỏi sâu hơn: nếu quan hệ I-P là phi tuyến, thì điều gì quyết định hình dạng và độ cong của nó, và vì sao độ cong đó khác nhau có hệ thống giữa các doanh nghiệp và nền kinh tế?</w:t>
       </w:r>
     </w:p>
     <w:p>
@@ -1957,7 +1972,7 @@
         <w:pStyle w:val="BodyText"/>
       </w:pPr>
       <w:r>
-        <w:t xml:space="preserve">Ba khoảng trống này hội tụ vào một hướng giải quyết chung: cần phát triển và kiểm định một khung giải thích tích hợp đa tầng trên dữ liệu đa quốc gia đủ rộng và đủ đa dạng về thể chế để bao phủ toàn bộ dải biến thiên thể chế của châu Á. Luận án đề xuất khung CDCM (Context-Contingent Digital-and-Capability Model — Mô hình năng lực và chấp nhận số phụ thuộc bối cảnh), một khung lý thuyết tích hợp đa tầng kết hợp bốn thành phần: bối cảnh thể chế ở tầng vĩ mô, được vận hành hóa bằng ICRV; năng lực doanh nghiệp ở tầng tổ chức, với TCI và DAI tách riêng; đặc điểm nhà quản trị cấp cao ở tầng cá nhân; và lớp mở rộng năng lực số. Trong khung này, FSTS là biến độc lập chính và năng suất lao động là biến phụ thuộc.</w:t>
+        <w:t xml:space="preserve">Ba khoảng trống này hội tụ vào một hướng giải quyết chung: cần phát triển và kiểm định một khung giải thích tích hợp đa tầng trên dữ liệu đa quốc gia đủ rộng và đủ đa dạng về thể chế để bao phủ toàn bộ dải biến thiên thể chế của châu Á. Luận án đề xuất khung CDCM (Context-Contingent Digital-and-Capability Model — Mô hình năng lực và chấp nhận số phụ thuộc bối cảnh), một khung lý thuyết tích hợp đa tầng kết hợp bốn thành phần: bối cảnh thể chế ở tầng vĩ mô, được vận hành hóa bằng ICRV; năng lực doanh nghiệp ở tầng tổ chức, với TCI và DAI tách riêng; đặc điểm nhà quản trị cấp cao ở tầng cá nhân, đưa vào như khối kiểm soát quản trị nội sinh; và lớp mở rộng năng lực số. Trong khung này, FSTS là biến độc lập chính và năng suất lao động là biến phụ thuộc.</w:t>
       </w:r>
     </w:p>
     <w:bookmarkEnd w:id="41"/>
@@ -1975,15 +1990,15 @@
         <w:pStyle w:val="FirstParagraph"/>
       </w:pPr>
       <w:r>
-        <w:t xml:space="preserve">Mô hình khái niệm của luận án vận hành theo logic đa tầng: quan hệ trung tâm giữa quốc tế hóa (FSTS) và hiệu quả hoạt động kinh doanh, đo bằng năng suất lao động, được điều tiết đồng thời bởi ba tầng can thiệp, cùng với lớp mở rộng năng lực số xuyên suốt.</w:t>
-      </w:r>
-    </w:p>
-    <w:p>
-      <w:pPr>
-        <w:pStyle w:val="BodyText"/>
-      </w:pPr>
-      <w:r>
-        <w:t xml:space="preserve">Ở tầng vĩ mô là bối cảnh thể chế, được vận hành hóa bằng khung ICRV với sáu nhóm con theo dải biến thiên từ tiên tiến dẫn dắt bằng đổi mới đến đảo nhỏ Thái Bình Dương. Tại tầng này, ICRV điều tiết quan hệ I-P qua hai cơ chế đã nêu ở Mục 2.3: mức độ khoảng trống thể chế chi phối chi phí giao dịch xuyên biên giới, còn chất lượng thể chế chi phối vị trí điểm uốn. Ở các nền kinh tế cận biên và đảo nhỏ, khoảng trống thể chế quá lớn có thể đảo ngược quan hệ I-P, biến lợi ích tiềm năng thành tổn thất thực tế.</w:t>
+        <w:t xml:space="preserve">Mô hình khái niệm của luận án vận hành theo logic đa tầng: quan hệ trung tâm giữa quốc tế hóa (FSTS) và hiệu quả hoạt động kinh doanh, đo bằng năng suất lao động, được điều tiết bởi bốn nhân tố điều tiết trọng tâm là TCI (H2), DAI (H3), chế độ thể chế ICRV (H5) và thời gian (H6), cùng với lớp mở rộng năng lực số xuyên suốt; đặc điểm nhà quản trị cấp cao ở tầng cá nhân được đưa vào như khối kiểm soát quản trị nội sinh chứ không phải một tầng điều tiết trọng tâm.</w:t>
+      </w:r>
+    </w:p>
+    <w:p>
+      <w:pPr>
+        <w:pStyle w:val="BodyText"/>
+      </w:pPr>
+      <w:r>
+        <w:t xml:space="preserve">Ở tầng vĩ mô là bối cảnh thể chế, được vận hành hóa bằng khung ICRV với sáu nhóm con theo dải biến thiên từ tiên tiến dẫn dắt bằng đổi mới đến đảo nhỏ Thái Bình Dương. Tại tầng này, ICRV điều tiết quan hệ I-P qua hai cơ chế đã nêu ở Mục 2.3: mức độ khoảng trống thể chế chi phối chi phí giao dịch xuyên biên giới, còn chất lượng thể chế chi phối độ cong của đường cong. Ở các nền kinh tế cận biên và đảo nhỏ, khoảng trống thể chế quá lớn có thể đảo ngược quan hệ I-P, biến lợi ích tiềm năng thành tổn thất thực tế.</w:t>
       </w:r>
     </w:p>
     <w:p>
@@ -1999,7 +2014,7 @@
         <w:pStyle w:val="BodyText"/>
       </w:pPr>
       <w:r>
-        <w:t xml:space="preserve">Ở tầng cá nhân là đặc điểm nhà quản trị cấp cao, gồm kinh nghiệm quản trị và giới tính nhà quản trị, đóng vai trò các yếu tố nâng mặt bằng hiệu quả. Kinh nghiệm quốc tế của nhà quản trị giảm chi phí nhận thức của gánh nặng người nước ngoài; sự hiện diện của quản trị viên nữ làm tăng tính đa dạng nhận thức và sự thận trọng trong quản trị rủi ro quốc tế.</w:t>
+        <w:t xml:space="preserve">Ở tầng cá nhân là đặc điểm nhà quản trị cấp cao, gồm kinh nghiệm, học vấn và giới tính nhà quản trị, được đưa vào như khối kiểm soát quản trị nội sinh nâng mặt bằng hiệu quả, không phải nhân tố điều tiết trọng tâm định hình độ cong của đường quan hệ I-P. Kinh nghiệm quốc tế của nhà quản trị giảm chi phí nhận thức của gánh nặng người nước ngoài; sự hiện diện của quản trị viên nữ làm tăng tính đa dạng nhận thức và sự thận trọng trong quản trị rủi ro quốc tế. Vì năng lực và sự đa dạng giới của nhà quản trị có thể đồng thời tác động đến quyết định xuất khẩu, đến năng lực công nghệ và đến năng suất, việc kiểm soát các đặc điểm này, thay vì đặt chúng làm trục điều tiết, khóa chặt thiên lệch nội sinh và bảo vệ tính nhân quả thuần khiết của tương tác Thể chế × Công nghệ.</w:t>
       </w:r>
     </w:p>
     <w:p>
@@ -2161,13 +2176,13 @@
           <w:bCs/>
           <w:b/>
         </w:rPr>
-        <w:t xml:space="preserve">Giả thuyết H4 (điều tiết bởi đặc điểm nhà quản trị cấp cao).</w:t>
+        <w:t xml:space="preserve">Giả thuyết H4 (kiểm soát quản trị nội sinh: đặc điểm nhà quản trị cấp cao).</w:t>
       </w:r>
       <w:r>
         <w:t xml:space="preserve"> </w:t>
       </w:r>
       <w:r>
-        <w:t xml:space="preserve">Lý thuyết Bậc trên (Hambrick &amp; Mason, 1984; Hambrick, 2007) cho rằng các quyết định chiến lược, trong đó có quốc tế hóa, phản ánh đặc điểm nhận thức, kinh nghiệm và giá trị của nhà quản trị cấp cao. Hsu et al. (2013) cho thấy kinh nghiệm quốc tế của nhà quản trị nâng cao khả năng nhận diện cơ hội và giảm nhận thức về gánh nặng người nước ngoài; Post và Byron (2015) gắn sự hiện diện của lãnh đạo nữ với quản trị rủi ro thận trọng và ra quyết định đa chiều. Từ đó:</w:t>
+        <w:t xml:space="preserve">Lý thuyết Bậc trên (Hambrick &amp; Mason, 1984; Hambrick, 2007) cho rằng các quyết định chiến lược, trong đó có quốc tế hóa, phản ánh đặc điểm nhận thức, kinh nghiệm và giá trị của nhà quản trị cấp cao. Hsu et al. (2013) cho thấy kinh nghiệm quốc tế của nhà quản trị nâng cao khả năng nhận diện cơ hội và giảm nhận thức về gánh nặng người nước ngoài; Post và Byron (2015) gắn sự hiện diện của lãnh đạo nữ với quản trị rủi ro thận trọng và ra quyết định đa chiều. Vì năng lực và sự đa dạng giới của nhà quản trị có thể đồng thời tác động đến quyết định xuất khẩu, đến năng lực công nghệ và đến năng suất, khung của luận án không nâng các đặc điểm này thành một trục điều tiết trọng tâm định hình độ cong của đường quan hệ I-P, mà đưa vào như nhóm biến kiểm soát quản trị nội sinh nhằm khóa chặt thiên lệch nội sinh và bảo vệ tính nhân quả thuần khiết của tương tác Thể chế × Công nghệ. Từ đó:</w:t>
       </w:r>
       <w:r>
         <w:t xml:space="preserve"> </w:t>
@@ -2177,7 +2192,7 @@
           <w:iCs/>
           <w:i/>
         </w:rPr>
-        <w:t xml:space="preserve">Kinh nghiệm quản trị và sự hiện diện của nhà quản trị nữ ở cấp cao làm mạnh thêm tác động tích cực của quốc tế hóa lên hiệu quả hoạt động, chủ yếu thông qua việc nâng mặt bằng hiệu quả, nhờ nâng cao nhận thức chiến lược quốc tế và quản trị rủi ro thận trọng hơn.</w:t>
+        <w:t xml:space="preserve">Kinh nghiệm quản trị và sự hiện diện của nhà quản trị nữ ở cấp cao nâng mặt bằng hiệu quả hoạt động và được đưa vào như nhóm biến kiểm soát quản trị nội sinh, không phải nhân tố điều tiết trọng tâm của đường cong I-P; ký hiệu H4 được giữ nguyên để tương thích với các bản thảo đồng hành (P3/P4/P5).</w:t>
       </w:r>
     </w:p>
     <w:p>
@@ -2195,7 +2210,7 @@
         <w:t xml:space="preserve"> </w:t>
       </w:r>
       <w:r>
-        <w:t xml:space="preserve">Lý thuyết thể chế (North, 1990; Khanna &amp; Palepu, 2010) cho rằng chất lượng thể chế quy định chi phí giao dịch và mức rủi ro mà doanh nghiệp phải gánh khi giao dịch xuyên biên giới, nên định hình lợi ích ròng của quốc tế hóa và vị trí điểm uốn. Marano et al. (2016) xác nhận thể chế quốc gia nguồn là biến điều tiết quan trọng nhất, có thể dịch chuyển điểm uốn đáng kể. Cơ chế là dải biến thiên của chi phí giao dịch, trong đó năng lực số có thể đóng vai trò thay thế một phần khoảng trống thể chế. Từ đó:</w:t>
+        <w:t xml:space="preserve">Lý thuyết thể chế (North, 1990; Khanna &amp; Palepu, 2010) cho rằng chất lượng thể chế quy định chi phí giao dịch và mức rủi ro mà doanh nghiệp phải gánh khi giao dịch xuyên biên giới, nên định hình lợi ích ròng của quốc tế hóa và độ cong của đường cong I-P. Marano et al. (2016) xác nhận thể chế quốc gia nguồn là biến điều tiết quan trọng nhất, có thể chi phối đáng kể độ cong của đường cong I-P. Cơ chế là dải biến thiên của chi phí giao dịch, trong đó năng lực số có thể đóng vai trò thay thế một phần khoảng trống thể chế. Từ đó:</w:t>
       </w:r>
       <w:r>
         <w:t xml:space="preserve"> </w:t>
@@ -2533,19 +2548,19 @@
               <w:jc w:val="left"/>
             </w:pPr>
             <w:r>
-              <w:t xml:space="preserve">H4</w:t>
-            </w:r>
-          </w:p>
-        </w:tc>
-        <w:tc>
-          <w:tcPr/>
-          <w:p>
-            <w:pPr>
-              <w:pStyle w:val="Compact"/>
-              <w:jc w:val="left"/>
-            </w:pPr>
-            <w:r>
-              <w:t xml:space="preserve">Đặc điểm nhà quản trị nâng mặt bằng</w:t>
+              <w:t xml:space="preserve">H4 (kiểm soát quản trị nội sinh)</w:t>
+            </w:r>
+          </w:p>
+        </w:tc>
+        <w:tc>
+          <w:tcPr/>
+          <w:p>
+            <w:pPr>
+              <w:pStyle w:val="Compact"/>
+              <w:jc w:val="left"/>
+            </w:pPr>
+            <w:r>
+              <w:t xml:space="preserve">Đặc điểm nhà quản trị nâng mặt bằng (kiểm soát quản trị nội sinh, không điều tiết độ cong)</w:t>
             </w:r>
           </w:p>
         </w:tc>
@@ -2595,7 +2610,7 @@
               <w:jc w:val="left"/>
             </w:pPr>
             <w:r>
-              <w:t xml:space="preserve">ICRV dịch chuyển điểm uốn</w:t>
+              <w:t xml:space="preserve">ICRV chi phối độ cong đường cong I-P</w:t>
             </w:r>
           </w:p>
         </w:tc>
@@ -2690,7 +2705,7 @@
         <w:pStyle w:val="FirstParagraph"/>
       </w:pPr>
       <w:r>
-        <w:t xml:space="preserve">Ba khoảng trống dẫn về một chương trình kiểm định gồm ba mảnh ghép bổ sung cho nhau. Khoảng trống thứ nhất và thứ ba cùng dẫn về câu hỏi liệu CDCM có giải thích đồng thời sự dị biệt của quan hệ I-P khi kiểm soát đầy đủ cả ba tầng trong một mô hình tích hợp, ở quy mô đủ rộng để bao phủ toàn bộ dải biến thiên ICRV hay không. Nghiên cứu P7 lấp khoảng trống này bằng dữ liệu WBES từ 45 nền kinh tế (N = 82.302-98.658 doanh nghiệp, 98 đợt quốc gia-năm), bao phủ toàn bộ dải biến thiên ICRV, kiểm định đồng thời H1-H6 với hiệu ứng cố định quốc gia-năm; điểm uốn trung bình khoảng 36% FSTS tại P7 thấp hơn so với Việt Nam (39-46%) và Trung Quốc (47-49%), qua đó xác nhận ICRV điều tiết vị trí điểm uốn đúng theo dải biến thiên mà lý thuyết dự đoán (Do &amp; Phan, 2026d). Khoảng trống thứ ba còn đòi hỏi kiểm định một điều kiện biên cực trị, đó là liệu có tồn tại bối cảnh nơi chữ U ngược sụp đổ hoàn toàn thành quan hệ âm đơn điệu hay không; Nghiên cứu P8 kiểm định H1b bằng dữ liệu WBES từ các nền kinh tế đảo nhỏ Thái Bình Dương, nơi ba điều kiện cấu trúc cơ bản của chữ U ngược cùng bị vi phạm (Do &amp; Phan, 2026b). Cùng với phân tích tổng hợp P6, ba mảnh ghép này tạo thành một chiến lược kiểm định toàn diện, từ tổng hợp bằng chứng quá khứ đến kiểm định tích hợp đa quốc gia và xác định điều kiện biên.</w:t>
+        <w:t xml:space="preserve">Ba khoảng trống dẫn về một chương trình kiểm định gồm ba mảnh ghép bổ sung cho nhau. Khoảng trống thứ nhất và thứ ba cùng dẫn về câu hỏi liệu CDCM có giải thích đồng thời sự dị biệt của quan hệ I-P khi kiểm soát đầy đủ cả ba tầng trong một mô hình tích hợp, ở quy mô đủ rộng để bao phủ toàn bộ dải biến thiên ICRV hay không. Nghiên cứu P7 lấp khoảng trống này bằng dữ liệu WBES từ 45 nền kinh tế (N = 82.302-98.658 doanh nghiệp, 98 đợt quốc gia-năm), bao phủ toàn bộ dải biến thiên ICRV, kiểm định đồng thời H1-H6 với hiệu ứng cố định quốc gia-năm; điểm uốn trung bình khoảng 36% FSTS tại P7 thấp hơn so với Việt Nam (39-46%) và Trung Quốc (47-49%) cho thấy điểm uốn cấp quốc gia biến thiên theo bối cảnh thể chế, nhất quán với việc ICRV chi phối hình dạng (độ cong) của quan hệ I-P như lý thuyết dự đoán (Do &amp; Phan, 2026d). Khoảng trống thứ ba còn đòi hỏi kiểm định một điều kiện biên cực trị, đó là liệu có tồn tại bối cảnh nơi chữ U ngược sụp đổ hoàn toàn thành quan hệ âm đơn điệu hay không; Nghiên cứu P8 kiểm định H1b bằng dữ liệu WBES từ các nền kinh tế đảo nhỏ Thái Bình Dương, nơi ba điều kiện cấu trúc cơ bản của chữ U ngược cùng bị vi phạm (Do &amp; Phan, 2026b). Cùng với phân tích tổng hợp P6, ba mảnh ghép này tạo thành một chiến lược kiểm định toàn diện, từ tổng hợp bằng chứng quá khứ đến kiểm định tích hợp đa quốc gia và xác định điều kiện biên.</w:t>
       </w:r>
     </w:p>
     <w:p>
@@ -2724,7 +2739,7 @@
         <w:pStyle w:val="BodyText"/>
       </w:pPr>
       <w:r>
-        <w:t xml:space="preserve">Phần đầu chương xác lập năm khái niệm cốt lõi: quốc tế hóa doanh nghiệp, hiệu quả hoạt động kinh doanh đo chủ yếu bằng năng suất lao động, cường độ xuất khẩu đo bằng FSTS, năng lực công nghệ (TCI) và mức độ chấp nhận số (DAI) như hai cấu trúc khái niệm độc lập. Phần lý thuyết nền phân tích bốn lý thuyết kinh điển là Uppsala, RBV, lý thuyết thể chế và lý thuyết Bậc trên, cùng lớp mở rộng là lăng kính số, đồng thời xác định vai trò của từng lý thuyết trong khung giải thích tổng thể. Khung phân tích ICRV được trình bày như một công cụ vận hành hóa bối cảnh thể chế thành sáu nhóm chế độ, đóng vai trò điều tiết quan hệ I-P qua cơ chế dịch chuyển điểm uốn và thay thế số cho thể chế.</w:t>
+        <w:t xml:space="preserve">Phần đầu chương xác lập năm khái niệm cốt lõi: quốc tế hóa doanh nghiệp, hiệu quả hoạt động kinh doanh đo chủ yếu bằng năng suất lao động, cường độ xuất khẩu đo bằng FSTS, năng lực công nghệ (TCI) và mức độ chấp nhận số (DAI) như hai cấu trúc khái niệm độc lập. Phần lý thuyết nền phân tích bốn lý thuyết kinh điển là Uppsala, RBV, lý thuyết thể chế và lý thuyết Bậc trên, cùng lớp mở rộng là lăng kính số, đồng thời xác định vai trò của từng lý thuyết trong khung giải thích tổng thể. Khung phân tích ICRV được trình bày như một công cụ vận hành hóa bối cảnh thể chế thành sáu nhóm chế độ, đóng vai trò điều tiết quan hệ I-P qua cơ chế thay đổi độ cong (biên độ) và thay thế số cho thể chế.</w:t>
       </w:r>
     </w:p>
     <w:p>

</xml_diff>